<commit_message>
new loading of chaps
</commit_message>
<xml_diff>
--- a/chapters/GTIchap1.docx
+++ b/chapters/GTIchap1.docx
@@ -655,7 +655,7 @@
           <w:szCs w:val="28"/>
           <w:rtl w:val="0"/>
         </w:rPr>
-        <w:t xml:space="preserve">Cookie opened her eyes, and she was no longer in the graveyard, no longer in the mobbish thrall of the hands. Rather, she was glued to the ground in some unidentifiable plane.</w:t>
+        <w:t xml:space="preserve">Cookie opened her eyes, and she was no longer in the graveyard, no longer in the mobbish clamouring of the hands. Rather, she was glued to the ground in some unidentifiable plane.</w:t>
         <w:br w:type="textWrapping"/>
       </w:r>
     </w:p>
@@ -1181,7 +1181,7 @@
           <w:szCs w:val="28"/>
           <w:rtl w:val="0"/>
         </w:rPr>
-        <w:t xml:space="preserve">With a breath so sharp it ached her teeth, she awoke to a late, low sun taking its leave of a sky moving overhead, and mountains passing beside her. “You were restless, are you alright?” asked a gentle voice, and Cooke turned to see her brother turning back to focus on the road ahead of his steer.</w:t>
+        <w:t xml:space="preserve">With a breath so sharp it ached her teeth, she awoke to a late, low sun taking its leave of a sky moving overhead, and mountains passing beside her. “You were restless, are you alright?” asked a gentle voice, and Cooke turned to see her brother’s eyes, glinting behind a pair of rounded spectacles, turning quickly back to focus on the road ahead of his steer.</w:t>
       </w:r>
     </w:p>
     <w:p>
@@ -1223,7 +1223,7 @@
           <w:szCs w:val="28"/>
           <w:rtl w:val="0"/>
         </w:rPr>
-        <w:t xml:space="preserve">“We’re still heading through the Godless lands, tail end, though, that’s Mount Dougal there blocking our sea view," he replied, pulling a napkin from his pocket and handing it over to her.</w:t>
+        <w:t xml:space="preserve">“We’re still heading through the Godless lands. We’re at the tail end, though, luckily. That’s Mount Dougal there blocking our sea view," he replied, pulling a napkin from his pocket and handing it over to her.</w:t>
       </w:r>
     </w:p>
     <w:p>
@@ -1307,7 +1307,7 @@
           <w:szCs w:val="28"/>
           <w:rtl w:val="0"/>
         </w:rPr>
-        <w:t xml:space="preserve">“I should have woken you sooner, I’m sorry, I ought to have realised you were having a nightmare," he said. “I just- it seemed like you needed the rest.”</w:t>
+        <w:t xml:space="preserve">“I should have woken you sooner, I’m sorry, I ought to have realised you were having a nightmare," he said, nervously tucking away locks of hair that had strayed from the plaits on the side of his head. “I just- it seemed like you needed the rest.”</w:t>
       </w:r>
     </w:p>
     <w:p>
@@ -1391,7 +1391,7 @@
           <w:szCs w:val="28"/>
           <w:rtl w:val="0"/>
         </w:rPr>
-        <w:t xml:space="preserve">“That would be unwise,” he said. “This entire province remains dark territory, and I suspect the Menyantic still keep an eye on Ferrier, as do the Diamondguard, the pair of them pointlessly locked in their cold war. It’s best not to get mixed up in any more complications. We’ll just pass through this few miles, and we’ll be done with it," </w:t>
+        <w:t xml:space="preserve">“That would be unwise,” he said, a white moustache on a young face twitching to deny her. “This entire province remains dark territory, and I suspect the Menyantic still keep an eye on Ferrier, as do the Diamondguard, the pair of them pointlessly locked in their cold war. It’s best not to get mixed up in any more complications. We’ll just pass through this few miles, and we’ll be done with it," </w:t>
       </w:r>
       <w:r>
         <w:rPr>
@@ -1576,7 +1576,7 @@
           <w:szCs w:val="28"/>
           <w:rtl w:val="0"/>
         </w:rPr>
-        <w:t xml:space="preserve">Silence became them, for a time. The car flew near-silently over the brick road, the wilderness winding around them in all directions. Cookie distracted herself, imagining the countless hours it had taken to place each slab on the ground, in its foundation no doubt just as carefully laid. How many bodies had given away a piece of their lifetime to this endless project, and for what? Was it their selflessness that drove them forward? She trained her eyes to the peak of an ice-dusted mountain moving by in the far distance, adjusting to wakefulness, and allowing her psyche to quieten and be willed to the crafting of ideas. After a moment, she had constructed her thoughts. </w:t>
+        <w:t xml:space="preserve">Silence became them, for a time. The car flew near-silently over the brick road, the wilderness winding around them in all directions. Cookie distracted herself, imagining the countless hours it had taken to place each slab on the ground, in its foundation no doubt just as carefully laid. How many bodies had given away a piece of their lifetime to this endless project, and for what? Was it their selflessness that drove them forward? She trained her eyes to the peak of an ice-dusted mountain moving by in the far distance, adjusting to wakefulness. The fields of yellow melon flowers sweeping across the landssape allowed her psyche to quieten and be willed to the crafting of ideas. After a moment, she had constructed her thoughts from the brightly coloured petals. </w:t>
       </w:r>
     </w:p>
     <w:p>
@@ -1597,7 +1597,7 @@
           <w:szCs w:val="28"/>
           <w:rtl w:val="0"/>
         </w:rPr>
-        <w:t xml:space="preserve">“I thought Glory was nice," she said, breaking the still air.</w:t>
+        <w:t xml:space="preserve">“I thought Glory was quite nice," she said, breaking the still air.</w:t>
       </w:r>
     </w:p>
     <w:p>
@@ -1662,7 +1662,7 @@
           <w:szCs w:val="28"/>
           <w:rtl w:val="0"/>
         </w:rPr>
-        <w:t xml:space="preserve">really represents. The New Dawn are agents of absolute chaos.”</w:t>
+        <w:t xml:space="preserve">really represents. The New Dawn are agents of absolute chaos, in truth.”</w:t>
       </w:r>
     </w:p>
     <w:p>
@@ -1766,7 +1766,7 @@
           <w:szCs w:val="28"/>
           <w:rtl w:val="0"/>
         </w:rPr>
-        <w:t xml:space="preserve">“Rebellion is a complex matter, it’s a reactionary process in which everything seems justifiable on both sides. </w:t>
+        <w:t xml:space="preserve">“I wouldn’t say that. Rebellion is a complex matter, it’s a reactionary process in which everything seems justifiable on both sides. </w:t>
       </w:r>
       <w:r>
         <w:rPr>
@@ -1812,27 +1812,49 @@
           <w:szCs w:val="28"/>
           <w:rtl w:val="0"/>
         </w:rPr>
-        <w:t xml:space="preserve">, as they say. Someone kills, someone exacts blood vengeance, it goes on this way until everyone forgets a time before it began,” he explained. “They are certain that they are liberators of the enslaved, and that they fight for freedom from tyranny for us all.”</w:t>
-      </w:r>
-    </w:p>
-    <w:p>
-      <w:pPr>
-        <w:rPr>
-          <w:rFonts w:ascii="Montserrat" w:cs="Montserrat" w:eastAsia="Montserrat" w:hAnsi="Montserrat"/>
-          <w:color w:val="ffffff"/>
-          <w:sz w:val="28"/>
-          <w:szCs w:val="28"/>
-        </w:rPr>
-      </w:pPr>
-      <w:r>
-        <w:rPr>
-          <w:rFonts w:ascii="Montserrat" w:cs="Montserrat" w:eastAsia="Montserrat" w:hAnsi="Montserrat"/>
-          <w:color w:val="ffffff"/>
-          <w:sz w:val="28"/>
-          <w:szCs w:val="28"/>
-          <w:rtl w:val="0"/>
-        </w:rPr>
-        <w:t xml:space="preserve">She turned back to the glass and the treasures falling away in the distance beyond it - trees of all shapes and sizes ravaged the landscape, reddish green leaves soaking up the lengthening rays and ever waiting for gusts from the north to scatter mountain snow across them.</w:t>
+        <w:t xml:space="preserve">, as they say. Someone kills, someone exacts blood vengeance, it goes on this way until everyone forgets a time before it began,” he explained. “The Dawn are certain that they are</w:t>
+      </w:r>
+      <w:r>
+        <w:rPr>
+          <w:rFonts w:ascii="Montserrat" w:cs="Montserrat" w:eastAsia="Montserrat" w:hAnsi="Montserrat"/>
+          <w:i w:val="1"/>
+          <w:iCs w:val="1"/>
+          <w:color w:val="ffffff"/>
+          <w:sz w:val="28"/>
+          <w:szCs w:val="28"/>
+          <w:rtl w:val="0"/>
+        </w:rPr>
+        <w:t xml:space="preserve"> liberators of the enslaved,</w:t>
+      </w:r>
+      <w:r>
+        <w:rPr>
+          <w:rFonts w:ascii="Montserrat" w:cs="Montserrat" w:eastAsia="Montserrat" w:hAnsi="Montserrat"/>
+          <w:color w:val="ffffff"/>
+          <w:sz w:val="28"/>
+          <w:szCs w:val="28"/>
+          <w:rtl w:val="0"/>
+        </w:rPr>
+        <w:t xml:space="preserve"> and that they fight for freedom from tyranny for us all. The Menyantic most probably see it their way, also, we seem quite alone in our atonement for the days of Esprich.”</w:t>
+      </w:r>
+    </w:p>
+    <w:p>
+      <w:pPr>
+        <w:rPr>
+          <w:rFonts w:ascii="Montserrat" w:cs="Montserrat" w:eastAsia="Montserrat" w:hAnsi="Montserrat"/>
+          <w:color w:val="ffffff"/>
+          <w:sz w:val="28"/>
+          <w:szCs w:val="28"/>
+        </w:rPr>
+      </w:pPr>
+      <w:r>
+        <w:rPr>
+          <w:rFonts w:ascii="Montserrat" w:cs="Montserrat" w:eastAsia="Montserrat" w:hAnsi="Montserrat"/>
+          <w:color w:val="ffffff"/>
+          <w:sz w:val="28"/>
+          <w:szCs w:val="28"/>
+          <w:rtl w:val="0"/>
+        </w:rPr>
+        <w:t xml:space="preserve">She turned from her verbose brother, back to the glass and the treasures falling away in the distance beyond it. Trees of all shapes and sizes ravaged the hills, reddish green leaves soaking up the lengthening rays and ever waiting for gusts from the north to scatter mountain snow across them on the day summer would come to its end.</w:t>
       </w:r>
     </w:p>
     <w:p>
@@ -1873,7 +1895,7 @@
           <w:szCs w:val="28"/>
           <w:rtl w:val="0"/>
         </w:rPr>
-        <w:t xml:space="preserve">. “We can get back into the house, reinvite Marcy, and Lenny! Won’t it be nice to have them back! We’ll restock the pantry, of course... Then, maybe we can do some boardwork, it’ll be just like the old days.” </w:t>
+        <w:t xml:space="preserve">, the slight curls of his fringe bouncing around with him. “We can get back into the house, reinvite Marcy, and Lenny! Won’t it be nice to have them back! We’ll restock the pantry, of course... Then, maybe we can do some boardwork, it’ll be just like the old days.” </w:t>
       </w:r>
     </w:p>
     <w:p>

</xml_diff>